<commit_message>
docs(eval1): rework narrative voice; em dashes out of the prose
Flowier first-person prose throughout the six sections and appendix
intros at Kaike's request. Em and en dashes removed from all body text;
the em dash survives only as the not-recorded marker inside data tables.
Content, tables, verdicts and page count (3 body + 4 appendix) are
unchanged. Coversheet row 4 and the AI-use log now cover the revision.

Co-Authored-By: Claude Fable 5 <noreply@anthropic.com>
Claude-Session: https://claude.ai/code/session_01HJgBo2QW83z2VCcKtrjwNt
</commit_message>
<xml_diff>
--- a/evaluations/AI-Acknowledgement-Evaluation-1-Kaike-Nehme.docx
+++ b/evaluations/AI-Acknowledgement-Evaluation-1-Kaike-Nehme.docx
@@ -1476,7 +1476,7 @@
             <w:r/>
             <w:bookmarkEnd w:id="22"/>
             <w:r>
-              <w:t>Generated the first draft of this document and its print layout (HTML/CSS to PDF) from the synthesis, the testing plan and the task sheet; I edited the wording and own every judgement in it</w:t>
+              <w:t>Generated the first draft of this document and its print layout (HTML/CSS to PDF) from the synthesis, the testing plan and the task sheet, then revised the narrative voice at my direction; I edited the wording and own every judgement in it</w:t>
             </w:r>
           </w:p>
         </w:tc>
@@ -1518,7 +1518,7 @@
             <w:r/>
             <w:bookmarkEnd w:id="23"/>
             <w:r>
-              <w:t>Draft Evaluation 1 to the six-section template in the task sheet, three pages plus appendices, from the findings and the IP1 testing plan</w:t>
+              <w:t>Draft Evaluation 1 to the six-section template in the task sheet, three pages plus appendices, from the findings and the IP1 testing plan; then: change the narrative a bit, make it more flowy and take the dashes out</w:t>
             </w:r>
           </w:p>
         </w:tc>
@@ -1602,7 +1602,7 @@
             <w:r/>
             <w:bookmarkEnd w:id="25"/>
             <w:r>
-              <w:t>30 August 2026</w:t>
+              <w:t>30 August and 1 September 2026</w:t>
             </w:r>
           </w:p>
         </w:tc>

</xml_diff>